<commit_message>
Tarea 1.2: bitacora e informe APA 7 actualizados con Colab y cambios finales
Co-Authored-By: Claude Sonnet 5 <noreply@anthropic.com>
</commit_message>
<xml_diff>
--- a/MAI540_Modulo 1_Tarea 1.2_Laoratorio_Desarrollo_Asistido/Informe_Tarea_1.2_APA7.docx
+++ b/MAI540_Modulo 1_Tarea 1.2_Laoratorio_Desarrollo_Asistido/Informe_Tarea_1.2_APA7.docx
@@ -409,6 +409,46 @@
     </w:p>
     <w:p>
       <w:pPr>
+        <w:ind w:firstLine="720"/>
+      </w:pPr>
+      <w:r>
+        <w:rPr>
+          <w:b w:val="0"/>
+          <w:i w:val="0"/>
+        </w:rPr>
+        <w:t xml:space="preserve">Posteriormente se pidió el informe en formato APA 7 y un cuaderno de Google Colab. Dos cosas no funcionaron a la primera: el informe inicial usaba fuente de 10,5 pt y márgenes de 1,25", por lo que no cumplía APA 7 y fue rehecho; y la primera versión del Colab incrustaba los datos como un bloque enorme de texto en base64, ilegible e inadecuado para una entrega, defecto que se detectó al abrirlo en Colab. Tras la instrucción «revisa el colab porque no está bien», la carga se cambió para leer </w:t>
+      </w:r>
+      <w:r>
+        <w:rPr>
+          <w:b w:val="0"/>
+          <w:i/>
+        </w:rPr>
+        <w:t>datos.csv</w:t>
+      </w:r>
+      <w:r>
+        <w:rPr>
+          <w:b w:val="0"/>
+          <w:i w:val="0"/>
+        </w:rPr>
+        <w:t xml:space="preserve"> desde el repositorio de GitHub, con subida manual como respaldo, y el cuaderno pasó de 456 KB a 41 KB. Además, la carpeta se borró del repositorio y del computador para regenerar el Colab y se volvió a publicar con todos los cambios; Claude hizo un respaldo local y sincronizó con </w:t>
+      </w:r>
+      <w:r>
+        <w:rPr>
+          <w:b w:val="0"/>
+          <w:i/>
+        </w:rPr>
+        <w:t>pull --rebase</w:t>
+      </w:r>
+      <w:r>
+        <w:rPr>
+          <w:b w:val="0"/>
+          <w:i w:val="0"/>
+        </w:rPr>
+        <w:t>, sin forzar.</w:t>
+      </w:r>
+    </w:p>
+    <w:p>
+      <w:pPr>
         <w:pStyle w:val="Heading2"/>
       </w:pPr>
       <w:r>
@@ -508,7 +548,21 @@
           <w:b w:val="0"/>
           <w:i w:val="0"/>
         </w:rPr>
-        <w:t xml:space="preserve"> fue rechazado; y (h) publicar solo la carpeta de la tarea, sin tocar otros cambios pendientes del repositorio.</w:t>
+        <w:t xml:space="preserve"> fue rechazado; (h) publicar solo la carpeta de la tarea, sin tocar otros cambios pendientes del repositorio; (i) incrustar los datos en base64 en el primer Colab (decisión errónea, corregida después); (j) ejecutar las celdas del Colab con un script propio y guardar sus salidas en el cuaderno, por no haber </w:t>
+      </w:r>
+      <w:r>
+        <w:rPr>
+          <w:b w:val="0"/>
+          <w:i/>
+        </w:rPr>
+        <w:t>nbconvert</w:t>
+      </w:r>
+      <w:r>
+        <w:rPr>
+          <w:b w:val="0"/>
+          <w:i w:val="0"/>
+        </w:rPr>
+        <w:t>; (k) rehacer el informe en APA 7; y (l) respaldar la carpeta antes de sincronizar con el remoto.</w:t>
       </w:r>
     </w:p>
     <w:p>
@@ -669,6 +723,46 @@
           <w:i w:val="0"/>
         </w:rPr>
         <w:t>. Finalmente, ambas matrices suman 1.125 casos de prueba con 224 insatisfechos reales.</w:t>
+      </w:r>
+    </w:p>
+    <w:p>
+      <w:pPr>
+        <w:ind w:firstLine="720"/>
+      </w:pPr>
+      <w:r>
+        <w:rPr>
+          <w:b w:val="0"/>
+          <w:i w:val="0"/>
+        </w:rPr>
+        <w:t xml:space="preserve">Del cuaderno de Colab se ejecutaron todas las celdas en local: sus salidas coinciden con </w:t>
+      </w:r>
+      <w:r>
+        <w:rPr>
+          <w:b w:val="0"/>
+          <w:i/>
+        </w:rPr>
+        <w:t>main.py</w:t>
+      </w:r>
+      <w:r>
+        <w:rPr>
+          <w:b w:val="0"/>
+          <w:i w:val="0"/>
+        </w:rPr>
+        <w:t xml:space="preserve"> y sus aserciones (diez variables, sin columnas prohibidas, partición del 25 %, matrices que suman 1.125 y ANTES = 0,8009) pasaron. También se comprobó que las direcciones de </w:t>
+      </w:r>
+      <w:r>
+        <w:rPr>
+          <w:b w:val="0"/>
+          <w:i/>
+        </w:rPr>
+        <w:t>datos.csv</w:t>
+      </w:r>
+      <w:r>
+        <w:rPr>
+          <w:b w:val="0"/>
+          <w:i w:val="0"/>
+        </w:rPr>
+        <w:t xml:space="preserve"> y del cuaderno en GitHub responden correctamente y que la copia de la carpeta en el computador es idéntica a la del repositorio. Queda pendiente ejecutarlo dentro de Colab.</w:t>
       </w:r>
     </w:p>
     <w:p>

</xml_diff>

<commit_message>
Tarea 1.2: explicacion propia incorporada en bitacora, informe APA 7 y Colab
Co-Authored-By: Claude Sonnet 5 <noreply@anthropic.com>
</commit_message>
<xml_diff>
--- a/MAI540_Modulo 1_Tarea 1.2_Laoratorio_Desarrollo_Asistido/Informe_Tarea_1.2_APA7.docx
+++ b/MAI540_Modulo 1_Tarea 1.2_Laoratorio_Desarrollo_Asistido/Informe_Tarea_1.2_APA7.docx
@@ -1609,9 +1609,72 @@
         <w:rPr>
           <w:b w:val="0"/>
           <w:i w:val="0"/>
-          <w:highlight w:val="yellow"/>
         </w:rPr>
-        <w:t>[Pendiente: redactar con las propias palabras del estudiante qué hace el código incorporado (conversión de timestamp a dia_semana, tratamiento de follow_up_required, ColumnTransformer con sus dos ramas, ajuste solo con entrenamiento, class_weight='balanced' y métricas de la clase positiva) y por qué resuelve el problema del modelo inicial. Explicar también por qué la exactitud engaña con clases desbalanceadas.]</w:t>
+        <w:t>El modelo original parecía bueno porque tenía 80 % de exactitud, pero en realidad no servía. Decía «No» a todos los clientes y nunca detectaba a los insatisfechos. Sacaba 80 % solo porque el 80 % de los clientes ya está satisfecho.</w:t>
+      </w:r>
+    </w:p>
+    <w:p>
+      <w:pPr>
+        <w:ind w:firstLine="720"/>
+      </w:pPr>
+      <w:r>
+        <w:rPr>
+          <w:b w:val="0"/>
+          <w:i w:val="0"/>
+        </w:rPr>
+        <w:t xml:space="preserve">Para mejorarlo hice tres cosas. Primero, le di más datos: pasé de 3 a 10 variables, y una de ellas, el día de la semana, la saqué de la fecha. Segundo, preparé los datos: rellené los vacíos, puse los números en la misma escala y convertí las categorías en 0 y 1 para que el modelo las entienda; todo se aprende solo con los datos de entrenamiento, para no hacer trampa. Tercero, le indiqué que los insatisfechos importan: con </w:t>
+      </w:r>
+      <w:r>
+        <w:rPr>
+          <w:b w:val="0"/>
+          <w:i/>
+        </w:rPr>
+        <w:t>class_weight='balanced'</w:t>
+      </w:r>
+      <w:r>
+        <w:rPr>
+          <w:b w:val="0"/>
+          <w:i w:val="0"/>
+        </w:rPr>
+        <w:t>, equivocarse con ellos pesa más.</w:t>
+      </w:r>
+    </w:p>
+    <w:p>
+      <w:pPr>
+        <w:ind w:firstLine="720"/>
+      </w:pPr>
+      <w:r>
+        <w:rPr>
+          <w:b w:val="0"/>
+          <w:i w:val="0"/>
+        </w:rPr>
+        <w:t xml:space="preserve">Comparé el antes y el después con los mismos datos de prueba. La exactitud casi no cambió (de 0,80 a 0,82), pero el </w:t>
+      </w:r>
+      <w:r>
+        <w:rPr>
+          <w:b w:val="0"/>
+          <w:i/>
+        </w:rPr>
+        <w:t>recall</w:t>
+      </w:r>
+      <w:r>
+        <w:rPr>
+          <w:b w:val="0"/>
+          <w:i w:val="0"/>
+        </w:rPr>
+        <w:t xml:space="preserve"> pasó de 0 a 0,71: ahora detecta 159 de 224 insatisfechos. A cambio hay 137 falsas alarmas, que me parece aceptable porque llamar a un cliente que estaba conforme cuesta menos que perder a uno insatisfecho.</w:t>
+      </w:r>
+    </w:p>
+    <w:p>
+      <w:pPr>
+        <w:ind w:firstLine="720"/>
+      </w:pPr>
+      <w:r>
+        <w:rPr>
+          <w:b w:val="0"/>
+          <w:i w:val="0"/>
+        </w:rPr>
+        <w:t>Es un modelo simple y los datos son sintéticos, así que no sé si funcionaría igual con clientes reales.</w:t>
       </w:r>
     </w:p>
     <w:p>

</xml_diff>